<commit_message>
Verteile Deckenanschlüsse neu: Randachsen immer, dazwischen höchstens 1125 mm (#124)
[A-26] trägt die Fassung vom 2026-09-14: erste und letzte Spannachse tragen
immer einen Deckenanschluss, dazwischen wird deterministisch die kleinst-
mögliche Punktzahl gesetzt, sodass kein Abstand 1125 mm überschreitet. Die
bisherige Je-Meter-Zählung ist damit abgelöst. Liegen die Spannachsen selbst
weiter auseinander, wird die nächste vorhandene Achse gesetzt und die Lücke
neu in validation.deckenanschluss_luecken benannt — nie eine Achse erfunden.
Der Override [A-27] bleibt unverändert und sperrt die Verteilung vollständig.

Core und Python-Orakel bit-gleich, Fixtures und Musterwand neu eingefroren,
Handbuch und Modul-1-Hinweistexte nachgezogen.

Co-Authored-By: Claude Fable 5 <noreply@anthropic.com>
</commit_message>
<xml_diff>
--- a/doku/SEMBLA_Handbuch.docx
+++ b/doku/SEMBLA_Handbuch.docx
@@ -16604,50 +16604,60 @@
           <w:b/>
           <w:bCs/>
         </w:rPr>
-        <w:t xml:space="preserve">Die Verteilung ist bewusst einfach und ausdrücklich keine Statik:</w:t>
-      </w:r>
-      <w:r>
-        <w:t xml:space="preserve"> </w:t>
-      </w:r>
-      <w:r>
-        <w:rPr>
-          <w:b/>
-          <w:bCs/>
-        </w:rPr>
-        <w:t xml:space="preserve">ein</w:t>
-      </w:r>
-      <w:r>
-        <w:t xml:space="preserve"> Anschlusspunkt je </w:t>
-      </w:r>
-      <w:r>
-        <w:rPr>
-          <w:b/>
-          <w:bCs/>
-        </w:rPr>
-        <w:t xml:space="preserve">angefangenem Meter Wandlänge</w:t>
-      </w:r>
-      <w:r>
-        <w:t xml:space="preserve">, </w:t>
-      </w:r>
-      <w:r>
-        <w:rPr>
-          <w:b/>
-          <w:bCs/>
-        </w:rPr>
-        <w:t xml:space="preserve">mindestens einer</w:t>
-      </w:r>
-      <w:r>
-        <w:t xml:space="preserve"> – auch eine Wand unter einem Meter trägt einen Punkt. Maßgebend ist die </w:t>
-      </w:r>
-      <w:r>
-        <w:rPr>
-          <w:b/>
-          <w:bCs/>
-        </w:rPr>
-        <w:t xml:space="preserve">volle Wandlänge</w:t>
-      </w:r>
-      <w:r>
-        <w:t xml:space="preserve">; </w:t>
+        <w:t xml:space="preserve">Die Verteilung ist bewusst einfach und ausdrücklich keine Statik</w:t>
+      </w:r>
+      <w:r>
+        <w:t xml:space="preserve"> (Fassung vom </w:t>
+      </w:r>
+      <w:r>
+        <w:rPr>
+          <w:b/>
+          <w:bCs/>
+        </w:rPr>
+        <w:t xml:space="preserve">2026-09-14</w:t>
+      </w:r>
+      <w:r>
+        <w:t xml:space="preserve">, Issue #124): die </w:t>
+      </w:r>
+      <w:r>
+        <w:rPr>
+          <w:b/>
+          <w:bCs/>
+        </w:rPr>
+        <w:t xml:space="preserve">erste und die letzte Spannachse</w:t>
+      </w:r>
+      <w:r>
+        <w:t xml:space="preserve"> der Wand tragen </w:t>
+      </w:r>
+      <w:r>
+        <w:rPr>
+          <w:b/>
+          <w:bCs/>
+        </w:rPr>
+        <w:t xml:space="preserve">immer</w:t>
+      </w:r>
+      <w:r>
+        <w:t xml:space="preserve"> einen Deckenanschluss, und zwischen zwei </w:t>
+      </w:r>
+      <w:r>
+        <w:rPr>
+          <w:b/>
+          <w:bCs/>
+        </w:rPr>
+        <w:t xml:space="preserve">benachbarten</w:t>
+      </w:r>
+      <w:r>
+        <w:t xml:space="preserve"> Deckenanschlüssen liegen </w:t>
+      </w:r>
+      <w:r>
+        <w:rPr>
+          <w:b/>
+          <w:bCs/>
+        </w:rPr>
+        <w:t xml:space="preserve">höchstens 1125 mm</w:t>
+      </w:r>
+      <w:r>
+        <w:t xml:space="preserve"> (neun Rasterfelder). </w:t>
       </w:r>
       <w:r>
         <w:rPr>
@@ -16694,100 +16704,40 @@
           <w:b/>
           <w:bCs/>
         </w:rPr>
-        <w:t xml:space="preserve">Gewählt wird deterministisch:</w:t>
-      </w:r>
-      <w:r>
-        <w:t xml:space="preserve"> gibt es </w:t>
-      </w:r>
-      <w:r>
-        <w:rPr>
-          <w:b/>
-          <w:bCs/>
-        </w:rPr>
-        <w:t xml:space="preserve">höchstens so viele</w:t>
-      </w:r>
-      <w:r>
-        <w:t xml:space="preserve"> Spannachsen wie Zielpunkte, werden </w:t>
-      </w:r>
-      <w:r>
-        <w:rPr>
-          <w:b/>
-          <w:bCs/>
-        </w:rPr>
-        <w:t xml:space="preserve">alle</w:t>
-      </w:r>
-      <w:r>
-        <w:t xml:space="preserve"> genommen und </w:t>
-      </w:r>
-      <w:r>
-        <w:rPr>
-          <w:b/>
-          <w:bCs/>
-        </w:rPr>
-        <w:t xml:space="preserve">nichts</w:t>
-      </w:r>
-      <w:r>
-        <w:t xml:space="preserve"> aufgefüllt. Sonst werden </w:t>
-      </w:r>
-      <w:r>
-        <w:rPr>
-          <w:b/>
-          <w:bCs/>
-        </w:rPr>
-        <w:t xml:space="preserve">erste und letzte</w:t>
-      </w:r>
-      <w:r>
-        <w:t xml:space="preserve"> Achse gesetzt und die übrigen Punkte </w:t>
-      </w:r>
-      <w:r>
-        <w:rPr>
-          <w:b/>
-          <w:bCs/>
-        </w:rPr>
-        <w:t xml:space="preserve">gleichmäßig über die Achsenliste</w:t>
-      </w:r>
-      <w:r>
-        <w:t xml:space="preserve"> verteilt – gezählt wird in </w:t>
-      </w:r>
-      <w:r>
-        <w:rPr>
-          <w:b/>
-          <w:bCs/>
-        </w:rPr>
-        <w:t xml:space="preserve">Achsen</w:t>
-      </w:r>
-      <w:r>
-        <w:t xml:space="preserve">, nicht in Millimetern, gerundet kaufmännisch </w:t>
-      </w:r>
-      <w:r>
-        <w:rPr>
-          <w:b/>
-          <w:bCs/>
-        </w:rPr>
-        <w:t xml:space="preserve">zur geraden Zahl</w:t>
-      </w:r>
-      <w:r>
-        <w:t xml:space="preserve"> wie im ganzen Rechenkern. Bei genau </w:t>
-      </w:r>
-      <w:r>
-        <w:rPr>
-          <w:b/>
-          <w:bCs/>
-        </w:rPr>
-        <w:t xml:space="preserve">einem</w:t>
-      </w:r>
-      <w:r>
-        <w:t xml:space="preserve"> Punkt gilt ausgesprochen die </w:t>
-      </w:r>
-      <w:r>
-        <w:rPr>
-          <w:b/>
-          <w:bCs/>
-        </w:rPr>
-        <w:t xml:space="preserve">erste</w:t>
-      </w:r>
-      <w:r>
-        <w:t xml:space="preserve"> Achse, statt eine Mitte zu erfinden. Die Rechnung ist eine </w:t>
+        <w:t xml:space="preserve">Gewählt wird deterministisch und mit der kleinstmöglichen Punktzahl:</w:t>
+      </w:r>
+      <w:r>
+        <w:t xml:space="preserve"> von links nach rechts wird jeweils die </w:t>
+      </w:r>
+      <w:r>
+        <w:rPr>
+          <w:b/>
+          <w:bCs/>
+        </w:rPr>
+        <w:t xml:space="preserve">entfernteste</w:t>
+      </w:r>
+      <w:r>
+        <w:t xml:space="preserve"> Spannachse gesetzt, die von der zuletzt gesetzten aus noch innerhalb von 1125 mm liegt, zuletzt zwingend die letzte Achse. Eine Wand mit nur </w:t>
+      </w:r>
+      <w:r>
+        <w:rPr>
+          <w:b/>
+          <w:bCs/>
+        </w:rPr>
+        <w:t xml:space="preserve">einer</w:t>
+      </w:r>
+      <w:r>
+        <w:t xml:space="preserve"> Spannachse trägt genau </w:t>
+      </w:r>
+      <w:r>
+        <w:rPr>
+          <w:b/>
+          <w:bCs/>
+        </w:rPr>
+        <w:t xml:space="preserve">einen</w:t>
+      </w:r>
+      <w:r>
+        <w:t xml:space="preserve"> Punkt. Die Rechnung ist eine </w:t>
       </w:r>
       <w:r>
         <w:rPr>
@@ -16818,6 +16768,56 @@
       </w:r>
       <w:r>
         <w:t xml:space="preserve">. – </w:t>
+      </w:r>
+      <w:r>
+        <w:rPr>
+          <w:b/>
+          <w:bCs/>
+        </w:rPr>
+        <w:t xml:space="preserve">Liegen schon die Spannachsen selbst weiter als 1125 mm auseinander, ist die Vorgabe dort unerfüllbar:</w:t>
+      </w:r>
+      <w:r>
+        <w:t xml:space="preserve"> gesetzt wird dann die nächste vorhandene Achse, und die Überschreitung wird </w:t>
+      </w:r>
+      <w:r>
+        <w:rPr>
+          <w:b/>
+          <w:bCs/>
+        </w:rPr>
+        <w:t xml:space="preserve">sichtbar benannt</w:t>
+      </w:r>
+      <w:r>
+        <w:t xml:space="preserve"> (validation.deckenanschluss_luecken, mit beiden Achsen und dem Abstand) – </w:t>
+      </w:r>
+      <w:r>
+        <w:rPr>
+          <w:b/>
+          <w:bCs/>
+        </w:rPr>
+        <w:t xml:space="preserve">nie</w:t>
+      </w:r>
+      <w:r>
+        <w:t xml:space="preserve"> eine Achse erfunden und </w:t>
+      </w:r>
+      <w:r>
+        <w:rPr>
+          <w:b/>
+          <w:bCs/>
+        </w:rPr>
+        <w:t xml:space="preserve">nie</w:t>
+      </w:r>
+      <w:r>
+        <w:t xml:space="preserve"> still kaschiert (</w:t>
+      </w:r>
+      <w:r>
+        <w:rPr>
+          <w:b/>
+          <w:bCs/>
+        </w:rPr>
+        <w:t xml:space="preserve">[P-9]</w:t>
+      </w:r>
+      <w:r>
+        <w:t xml:space="preserve">). Kein Baubarkeitsausschluss. – </w:t>
       </w:r>
       <w:r>
         <w:rPr>
@@ -17379,7 +17379,17 @@
         <w:spacing w:after="120" w:before="80"/>
       </w:pPr>
       <w:r>
-        <w:t xml:space="preserve">Herkunft [A-26]/[A-27]: Issue #95, zweites Arbeitspaket, mit der fachlichen Präzisierung vom 2026-09-08 – ein Deckenanschluss je Meter Wandlänge, End-/Randachsen zählen mit, bewusst ohne Statik – und der Festlegung desselben Tages, dass jede Spannachse Kandidat ist und die Staffelung keine eigene Anschlussebene bekommt. Mit [P-24] war bis dahin nur die Baugruppe angelegt: der Rechenkern kannte die Einbaustelle nicht, die Baugruppe blieb darum ausdrücklich unaufgelöst, und eine Anzahl ließ sich nirgends gewinnen. Nicht Gegenstand des zweiten Pakets waren die Darstellung des Symbols in Wandansicht und Zeichnung ([D-4]/[D-10], #97) – die Griffe des Editiermodus sind eine Bedienhilfe und nur bei aktivem Modus vorhanden – und die Stücklistenmenge samt der nach [P-24] nötigen Verrechnung mit der Baugruppe „Wandabschluss“; beides ist mit dem dritten Arbeitspaket zu #95 nachgezogen. Ebenso bewusst nicht: ein Verankerungs- oder Winkelnachweis; Modul 3 bleibt unverändert.</w:t>
+        <w:t xml:space="preserve">Herkunft [A-26]/[A-27]: Issue #95, zweites Arbeitspaket, mit der fachlichen Präzisierung vom 2026-09-08 – bewusst ohne Statik – und der Festlegung desselben Tages, dass jede Spannachse Kandidat ist und die Staffelung keine eigene Anschlussebene bekommt. Die </w:t>
+      </w:r>
+      <w:r>
+        <w:rPr>
+          <w:b/>
+          <w:bCs/>
+        </w:rPr>
+        <w:t xml:space="preserve">Verteilregel selbst trägt seit Issue #124 die Fassung vom 2026-09-14</w:t>
+      </w:r>
+      <w:r>
+        <w:t xml:space="preserve">: Anfangs- und Endachse immer, dazwischen höchstens 1125 mm Abstand – sie ersetzt die ursprüngliche Fassung „ein Deckenanschluss je angefangenem Meter Wandlänge, gleichmäßig über die Achsenliste“. [A-27] ist davon unberührt: ein Override sperrt die Verteilung weiterhin vollständig, und die 1125-mm-Meldung gilt ausdrücklich nur dem Auto-Pfad – die gesetzte Liste ist die Entscheidung des Planers. Mit [P-24] war bis dahin nur die Baugruppe angelegt: der Rechenkern kannte die Einbaustelle nicht, die Baugruppe blieb darum ausdrücklich unaufgelöst, und eine Anzahl ließ sich nirgends gewinnen. Nicht Gegenstand des zweiten Pakets waren die Darstellung des Symbols in Wandansicht und Zeichnung ([D-4]/[D-10], #97) – die Griffe des Editiermodus sind eine Bedienhilfe und nur bei aktivem Modus vorhanden – und die Stücklistenmenge samt der nach [P-24] nötigen Verrechnung mit der Baugruppe „Wandabschluss“; beides ist mit dem dritten Arbeitspaket zu #95 nachgezogen. Ebenso bewusst nicht: ein Verankerungs- oder Winkelnachweis; Modul 3 bleibt unverändert.</w:t>
       </w:r>
     </w:p>
     <w:p>

</xml_diff>

<commit_message>
Teileart Standardteil/Sonderteil/Normteil in der Stückliste; Reststück ist Standardteil (#126)
Entscheid Tibor 2026-09-14: Die Stückliste kennzeichnet jede aufgelöste
Position mit genau einer von drei Teilearten — Sonderteil (Sonderzuschnitt),
Normteil (Norm-Feld des nach [P-14] aufgelösten Produkts gefüllt) oder
Standardteil. Das Reststück ([Z-6]) ist keine eigene Teileart mehr: es ist
ein Standardteil aus dem Katalog und bleibt nur als eigene Position mit
Fertigmaß unterscheidbar. Interne art-Werte und Preisrolle unverändert.

Dazu: Gesamtstückliste-Dateien führen eine stets leere Kommentarspalte
(Kommentare bleiben Wandangaben, #81), Legenden in Modul 4/7 und PDF
nachgezogen, Handbuch [P-19] aktualisiert (inkl. veraltetem Satz zum
Kommentar-Export). Volle Suite grün (291 Dateien).

Co-Authored-By: Claude Fable 5 <noreply@anthropic.com>
Claude-Session: https://claude.ai/code/session_014WebpsQw3k8183nQUG4oB1
</commit_message>
<xml_diff>
--- a/doku/SEMBLA_Handbuch.docx
+++ b/doku/SEMBLA_Handbuch.docx
@@ -9331,7 +9331,57 @@
         <w:t xml:space="preserve">Einbauteil-Kennzeichnung der Gewindestangenstücke ([P-19]):</w:t>
       </w:r>
       <w:r>
-        <w:t xml:space="preserve"> Jedes Stück trägt eine deterministische Einbauteil-ID nach dem Schema GS-k&lt;Spannachse&gt;.&lt;Segment von unten&gt;.&lt;Stück von unten&gt;, dazu Kategorie, Art (Standardteil / Sonderzuschnitt / Reststück), Fertigmaß und die Wandreferenz. Gleichartige Fertigteile stehen im Baustellenarbeitsblatt als </w:t>
+        <w:t xml:space="preserve"> Jedes Stück trägt eine deterministische Einbauteil-ID nach dem Schema GS-k&lt;Spannachse&gt;.&lt;Segment von unten&gt;.&lt;Stück von unten&gt;, dazu Kategorie, Teileart, Fertigmaß und die Wandreferenz. Die </w:t>
+      </w:r>
+      <w:r>
+        <w:rPr>
+          <w:b/>
+          <w:bCs/>
+        </w:rPr>
+        <w:t xml:space="preserve">Teileart</w:t>
+      </w:r>
+      <w:r>
+        <w:t xml:space="preserve"> kennt genau drei Werte (Entscheid 2026-09-14): </w:t>
+      </w:r>
+      <w:r>
+        <w:rPr>
+          <w:b/>
+          <w:bCs/>
+        </w:rPr>
+        <w:t xml:space="preserve">Sonderteil</w:t>
+      </w:r>
+      <w:r>
+        <w:t xml:space="preserve"> (Sonderzuschnitt mit Fertigmaß), </w:t>
+      </w:r>
+      <w:r>
+        <w:rPr>
+          <w:b/>
+          <w:bCs/>
+        </w:rPr>
+        <w:t xml:space="preserve">Normteil</w:t>
+      </w:r>
+      <w:r>
+        <w:t xml:space="preserve"> (das nach [P-14] aufgelöste Katalogprodukt trägt ein gefülltes Norm-Feld) und </w:t>
+      </w:r>
+      <w:r>
+        <w:rPr>
+          <w:b/>
+          <w:bCs/>
+        </w:rPr>
+        <w:t xml:space="preserve">Standardteil</w:t>
+      </w:r>
+      <w:r>
+        <w:t xml:space="preserve"> (alles Übrige). Das Reststück am oberen Wandabschluss ([Z-6]) ist </w:t>
+      </w:r>
+      <w:r>
+        <w:rPr>
+          <w:b/>
+          <w:bCs/>
+        </w:rPr>
+        <w:t xml:space="preserve">keine eigene Teileart</w:t>
+      </w:r>
+      <w:r>
+        <w:t xml:space="preserve">: es ist ein Standardteil aus dem Bauteilkatalog (eigene Rolle rod_rest) und bleibt nur als eigene Position mit eigenem Fertigmaß unterscheidbar. Ohne aufgelöstes Produkt und ohne Stückart bleibt die Teileart leer – es wird keine geraten. Gleichartige Fertigteile stehen im Baustellenarbeitsblatt als </w:t>
       </w:r>
       <w:r>
         <w:rPr>
@@ -9599,17 +9649,7 @@
         <w:t xml:space="preserve">derselben</w:t>
       </w:r>
       <w:r>
-        <w:t xml:space="preserve"> Positionskennung wie die manuelle Menge, wird wandbezogen unter eingaben.kosten gespeichert und ausschließlich in Modul 4 geschrieben; das Wandelement bleibt unberührt. Zulässig ist eine einzeilige Angabe bis 200 Zeichen – ein anderer Wert wird benannt abgewiesen und nie gekürzt. Leeren entfernt genau diesen einen Kommentar. Ein Kommentar, der zu keiner gerechneten Position mehr passt, und ein unzulässig gespeicherter Wert werden namentlich gemeldet, nicht angewandt und weder gelöscht noch umgehängt. Auf den Mengenebenen über der Wand erscheint er nicht, weil eine Zeile dort für mehrere Wände steht; das Blatt sagt es. In den Exportdateien steht er derzeit </w:t>
-      </w:r>
-      <w:r>
-        <w:rPr>
-          <w:b/>
-          <w:bCs/>
-        </w:rPr>
-        <w:t xml:space="preserve">nicht</w:t>
-      </w:r>
-      <w:r>
-        <w:t xml:space="preserve"> – ob er dorthin gehört, ist offen und wird nicht vorweggenommen.</w:t>
+        <w:t xml:space="preserve"> Positionskennung wie die manuelle Menge, wird wandbezogen unter eingaben.kosten gespeichert und ausschließlich in Modul 4 geschrieben; das Wandelement bleibt unberührt. Zulässig ist eine einzeilige Angabe bis 200 Zeichen – ein anderer Wert wird benannt abgewiesen und nie gekürzt. Leeren entfernt genau diesen einen Kommentar. Ein Kommentar, der zu keiner gerechneten Position mehr passt, und ein unzulässig gespeicherter Wert werden namentlich gemeldet, nicht angewandt und weder gelöscht noch umgehängt. Auf den Mengenebenen über der Wand erscheint er nicht, weil eine Zeile dort für mehrere Wände steht; das Blatt sagt es. In den Exportdateien steht er auf genau der Ebene, auf der er erfasst wurde: die Baustellenstückliste der Wandebene führt ihn als angehängte letzte Spalte (in beiden Mengenfassungen wortgleich); die Gesamtstücklisten der Geschoss-, Gebäude- und Projektebene führen die Spalte im gleichen Format, aber stets leer – dort steht eine Zeile für mehrere Wände, und zusammengeführt wird nichts.</w:t>
       </w:r>
     </w:p>
     <w:p>

</xml_diff>

<commit_message>
Gewindestangen: eigene Farbe je Standardlaenge nach Katalograng, Legende mit Laengen ([D-4], #112)
- Farbe einer Standardlaenge = Rang in den Standardlaengen des Katalogs (absteigend),
  nicht in den Stuecken der Wand: stangenKatalogLaengen (sembla-katalog.js),
  stangenFarbFolge/stueckFarbe/stangenLegende (sembla-montage.js). Keine Laenge im Code.
- Palette Blau #1f6feb / Gruen #3a9d23, danach deterministische Fortsetzung mit
  Mindestabstand (CIE76) zu allen Kennfarben.
- Reststueck Pink #e64980 statt Violett #7a3fd6 (lag mit dE~10 am Verzahnungs-Violett).
- Modul 1, Modul 5, Modul 7, zentraler Export und Zeichnungs-PDF nutzen dieselbe
  Zuordnung; Katalogliste reist als Laufzeitangabe stangen_laengen_mm (nicht gespeichert).
- Legende nennt nur gezeichnete Stangen: "Gewindestange <L> mm", Sonderzuschnitt,
  "Reststueck oben (<L> mm)".
- Regelwerk [D-4] fortgeschrieben, Handbuch neu gebaut, chg-Eintrag, Tests.

Co-Authored-By: Claude Opus 5.5 <noreply@anthropic.com>
</commit_message>
<xml_diff>
--- a/doku/SEMBLA_Handbuch.docx
+++ b/doku/SEMBLA_Handbuch.docx
@@ -30320,7 +30320,137 @@
         <w:t xml:space="preserve">nicht erfunden</w:t>
       </w:r>
       <w:r>
-        <w:t xml:space="preserve">. Jedes Stück wird mit seiner </w:t>
+        <w:t xml:space="preserve">. </w:t>
+      </w:r>
+      <w:r>
+        <w:rPr>
+          <w:b/>
+          <w:bCs/>
+        </w:rPr>
+        <w:t xml:space="preserve">Jede Standardlänge trägt ihre eigene Farbe:</w:t>
+      </w:r>
+      <w:r>
+        <w:t xml:space="preserve"> maßgebend ist der </w:t>
+      </w:r>
+      <w:r>
+        <w:rPr>
+          <w:b/>
+          <w:bCs/>
+        </w:rPr>
+        <w:t xml:space="preserve">Rang der Länge in den Standardlängen des zugeordneten Bauteilkatalogs</w:t>
+      </w:r>
+      <w:r>
+        <w:t xml:space="preserve"> (absteigend, die längste zuerst; Produkte, die ausdrücklich nur eine andere Rolle benennen – etwa das Reststück –, zählen nicht) und </w:t>
+      </w:r>
+      <w:r>
+        <w:rPr>
+          <w:b/>
+          <w:bCs/>
+        </w:rPr>
+        <w:t xml:space="preserve">nicht</w:t>
+      </w:r>
+      <w:r>
+        <w:t xml:space="preserve"> ihr Rang in den Stücken der einzelnen Wand – dieselbe Länge trägt damit in </w:t>
+      </w:r>
+      <w:r>
+        <w:rPr>
+          <w:b/>
+          <w:bCs/>
+        </w:rPr>
+        <w:t xml:space="preserve">jeder</w:t>
+      </w:r>
+      <w:r>
+        <w:t xml:space="preserve"> Wand des Projekts und in </w:t>
+      </w:r>
+      <w:r>
+        <w:rPr>
+          <w:b/>
+          <w:bCs/>
+        </w:rPr>
+        <w:t xml:space="preserve">jeder</w:t>
+      </w:r>
+      <w:r>
+        <w:t xml:space="preserve"> Ansicht dieselbe Farbe. Längen stehen dafür </w:t>
+      </w:r>
+      <w:r>
+        <w:rPr>
+          <w:b/>
+          <w:bCs/>
+        </w:rPr>
+        <w:t xml:space="preserve">nie</w:t>
+      </w:r>
+      <w:r>
+        <w:t xml:space="preserve"> im Code: kommt eine Standardlänge in den Katalog, bekommt sie ohne Codeänderung ihre Farbe aus einer </w:t>
+      </w:r>
+      <w:r>
+        <w:rPr>
+          <w:b/>
+          <w:bCs/>
+        </w:rPr>
+        <w:t xml:space="preserve">festen, geordneten Palette</w:t>
+      </w:r>
+      <w:r>
+        <w:t xml:space="preserve"> (die längste Blau, die zweite Grün) bzw. aus deren </w:t>
+      </w:r>
+      <w:r>
+        <w:rPr>
+          <w:b/>
+          <w:bCs/>
+        </w:rPr>
+        <w:t xml:space="preserve">deterministischer Fortsetzung</w:t>
+      </w:r>
+      <w:r>
+        <w:t xml:space="preserve">, die zu allen übrigen Kennfarben und zu den bereits vergebenen Stangenfarben einen Mindestabstand hält. Ohne Katalog gilt die im Wandelement geführte Auswahl der Standardlängen, bei einem Altstand ohne Längenliste die vorhandenen Längen der Wand; eine Länge, die in der maßgebenden Folge fehlt, wird </w:t>
+      </w:r>
+      <w:r>
+        <w:rPr>
+          <w:b/>
+          <w:bCs/>
+        </w:rPr>
+        <w:t xml:space="preserve">hinten</w:t>
+      </w:r>
+      <w:r>
+        <w:t xml:space="preserve"> angehängt und verschiebt die Katalogränge nicht. </w:t>
+      </w:r>
+      <w:r>
+        <w:rPr>
+          <w:b/>
+          <w:bCs/>
+        </w:rPr>
+        <w:t xml:space="preserve">Orange bleibt allein dem Sonderzuschnitt vorbehalten</w:t>
+      </w:r>
+      <w:r>
+        <w:t xml:space="preserve">, das Reststück trägt eine </w:t>
+      </w:r>
+      <w:r>
+        <w:rPr>
+          <w:b/>
+          <w:bCs/>
+        </w:rPr>
+        <w:t xml:space="preserve">eigene dritte Farbe</w:t>
+      </w:r>
+      <w:r>
+        <w:t xml:space="preserve"> (Pink – das frühere Violett war vom Violett der Verzahnungskennzeichnung nicht unterscheidbar), und </w:t>
+      </w:r>
+      <w:r>
+        <w:rPr>
+          <w:b/>
+          <w:bCs/>
+        </w:rPr>
+        <w:t xml:space="preserve">Kopplungsmuttern</w:t>
+      </w:r>
+      <w:r>
+        <w:t xml:space="preserve"> tragen </w:t>
+      </w:r>
+      <w:r>
+        <w:rPr>
+          <w:b/>
+          <w:bCs/>
+        </w:rPr>
+        <w:t xml:space="preserve">keine</w:t>
+      </w:r>
+      <w:r>
+        <w:t xml:space="preserve"> Stangenfarbe. Jedes Stück wird mit seiner </w:t>
       </w:r>
       <w:r>
         <w:rPr>
@@ -30410,7 +30540,27 @@
         <w:t xml:space="preserve">Legende</w:t>
       </w:r>
       <w:r>
-        <w:t xml:space="preserve"> mit denselben Texten und in derselben Reihenfolge (Standardlänge, Sonderzuschnitt, Reststück); zeichnet sie – etwa bei einem Altstand ohne stuecke – nicht stückweise, entfällt die Legende ersatzlos statt eine leere oder unbelegte Legende zu zeigen. Darüber hinaus zeigt das </w:t>
+        <w:t xml:space="preserve"> mit denselben Texten und in derselben Reihenfolge – </w:t>
+      </w:r>
+      <w:r>
+        <w:rPr>
+          <w:b/>
+          <w:bCs/>
+        </w:rPr>
+        <w:t xml:space="preserve">jede gezeichnete Standardlänge mit ihrer Länge</w:t>
+      </w:r>
+      <w:r>
+        <w:t xml:space="preserve"> (etwa „Gewindestange 1050 mm“), dann Sonderzuschnitt, dann Reststück mit seiner Länge – und nennt </w:t>
+      </w:r>
+      <w:r>
+        <w:rPr>
+          <w:b/>
+          <w:bCs/>
+        </w:rPr>
+        <w:t xml:space="preserve">nur</w:t>
+      </w:r>
+      <w:r>
+        <w:t xml:space="preserve">, was im Bild bzw. Blatt auch vorkommt; zeichnet sie – etwa bei einem Altstand ohne stuecke – nicht stückweise, entfällt die Legende ersatzlos statt eine leere oder unbelegte Legende zu zeigen. Darüber hinaus zeigt das </w:t>
       </w:r>
       <w:r>
         <w:rPr>
@@ -30472,7 +30622,57 @@
         <w:spacing w:after="120" w:before="80"/>
       </w:pPr>
       <w:r>
-        <w:t xml:space="preserve">Herkunft [D-4]: ursprünglich Issue #36 als Darstellungsschlüssel allein des Zeichnungsblatts formuliert; auf Modul 1 und Modul 5 erweitert mit Issue #49 (Bearbeitung 2026-08-06). Zuvor führte jedes Modul seine Stangenfarben selbst: Modul 5 zeichnete den ganzen Strang in einer Farbe (der Zuschnitt war im Baugruppenbild also gar nicht ablesbar), Modul 1 und Modul 7 verwendeten für denselben Sonderzuschnitt verschiedene Farbwerte, und die Sonderzuschnittsfarbe war in Modul 1/5 gleichzeitig die Farbe der Spannplatte. Es fehlte die Regel, dass Stückarten EINE gemeinsame Quelle für Farbe und Klartext haben und dass Bauteil- und Zuschnittfarben getrennt bleiben.</w:t>
+        <w:t xml:space="preserve">Herkunft [D-4]: ursprünglich Issue #36 als Darstellungsschlüssel allein des Zeichnungsblatts formuliert; auf Modul 1 und Modul 5 erweitert mit Issue #49 (Bearbeitung 2026-08-06). Zuvor führte jedes Modul seine Stangenfarben selbst: Modul 5 zeichnete den ganzen Strang in einer Farbe (der Zuschnitt war im Baugruppenbild also gar nicht ablesbar), Modul 1 und Modul 7 verwendeten für denselben Sonderzuschnitt verschiedene Farbwerte, und die Sonderzuschnittsfarbe war in Modul 1/5 gleichzeitig die Farbe der Spannplatte. Es fehlte die Regel, dass Stückarten EINE gemeinsame Quelle für Farbe und Klartext haben und dass Bauteil- und Zuschnittfarben getrennt bleiben. – </w:t>
+      </w:r>
+      <w:r>
+        <w:rPr>
+          <w:b/>
+          <w:bCs/>
+        </w:rPr>
+        <w:t xml:space="preserve">Fortgeschrieben am 2026-10-07</w:t>
+      </w:r>
+      <w:r>
+        <w:t xml:space="preserve"> (Entscheidung Tibor): bis dahin trugen </w:t>
+      </w:r>
+      <w:r>
+        <w:rPr>
+          <w:b/>
+          <w:bCs/>
+        </w:rPr>
+        <w:t xml:space="preserve">alle</w:t>
+      </w:r>
+      <w:r>
+        <w:t xml:space="preserve"> Standardlängen dieselbe Farbe, sodass 1050 mm und 820 mm im Bild nicht zu unterscheiden waren, und die Legende nannte die Stangenarten auch dann, wenn sie gar nicht gezeichnet waren. Neu sind die Farbe </w:t>
+      </w:r>
+      <w:r>
+        <w:rPr>
+          <w:b/>
+          <w:bCs/>
+        </w:rPr>
+        <w:t xml:space="preserve">je Standardlänge</w:t>
+      </w:r>
+      <w:r>
+        <w:t xml:space="preserve"> nach ihrem </w:t>
+      </w:r>
+      <w:r>
+        <w:rPr>
+          <w:b/>
+          <w:bCs/>
+        </w:rPr>
+        <w:t xml:space="preserve">Katalograng</w:t>
+      </w:r>
+      <w:r>
+        <w:t xml:space="preserve"> (bewusst nicht nach den Stücken der Wand, sonst wechselte dieselbe Länge je Wand die Farbe), die Legende </w:t>
+      </w:r>
+      <w:r>
+        <w:rPr>
+          <w:b/>
+          <w:bCs/>
+        </w:rPr>
+        <w:t xml:space="preserve">mit Längen und nur für Gezeichnetes</w:t>
+      </w:r>
+      <w:r>
+        <w:t xml:space="preserve"> und die neue Reststückfarbe; Sonderzuschnitt-Orange, Stückableitung, Mengen und Geometrie sind unverändert.</w:t>
       </w:r>
     </w:p>
     <w:p>

</xml_diff>

<commit_message>
Wandfuss: Sechskantschraube massstaeblich, eigene Farben fuer Schraube und Kopplungsmutter ([D-4]/[D-9], #97)
- Schaft = Gewinde-Nenndurchmesser des Katalogprodukts (M10 -> 10 mm), neues
  durchgereichtes Feld prestress.senkkopf_d_mm (Modul 1/sembla-wandanlage ->
  Engine -> Core + Python-Orakel), abgeleitet ueber gewindeDurchmesserMm().
- Kopf so breit wie die Schluesselweite (17 mm), Kopfhoehe Normmass DIN 933 M10
  (SPANN_MM.kopf_h_mm = 7). Ohne Katalogmasse bleibt die Schraube bit-gleich
  Symbol. Hebt den Paketentscheid aus #97 (Kopf = Schaft) auf.
- SPANN_FARBE.schraube (#5c3d1e) und SPANN_FARBE.kupplung (#ff00ff, Pink) —
  unterscheidbar von Reststueck und Ausgleichspunkt; Legenden in Modul 1, Modul 7
  und Zeichnungs-PDF nachgezogen. Handbuch [D-9] ergaenzt.
- Statik, Stueckliste und Mengen unveraendert; kein neues Katalogfeld.

Co-Authored-By: Claude Opus 5.5 <noreply@anthropic.com>
</commit_message>
<xml_diff>
--- a/doku/SEMBLA_Handbuch.docx
+++ b/doku/SEMBLA_Handbuch.docx
@@ -31522,7 +31522,107 @@
         <w:t xml:space="preserve">einen</w:t>
       </w:r>
       <w:r>
-        <w:t xml:space="preserve"> Richtung dem Maßstab und bleibt in seiner Dicke fest. Die Symbolgeometrie liegt – wie der Zuschnittschlüssel (</w:t>
+        <w:t xml:space="preserve"> Richtung dem Maßstab. </w:t>
+      </w:r>
+      <w:r>
+        <w:rPr>
+          <w:b/>
+          <w:bCs/>
+        </w:rPr>
+        <w:t xml:space="preserve">Maßstäblich</w:t>
+      </w:r>
+      <w:r>
+        <w:t xml:space="preserve"> ist seit dem 2026-10-07 auch die </w:t>
+      </w:r>
+      <w:r>
+        <w:rPr>
+          <w:b/>
+          <w:bCs/>
+        </w:rPr>
+        <w:t xml:space="preserve">Sechskantschraube am Fuß</w:t>
+      </w:r>
+      <w:r>
+        <w:t xml:space="preserve">, sobald ihre Maße vorliegen: der </w:t>
+      </w:r>
+      <w:r>
+        <w:rPr>
+          <w:b/>
+          <w:bCs/>
+        </w:rPr>
+        <w:t xml:space="preserve">Schaft</w:t>
+      </w:r>
+      <w:r>
+        <w:t xml:space="preserve"> ist so breit wie der </w:t>
+      </w:r>
+      <w:r>
+        <w:rPr>
+          <w:b/>
+          <w:bCs/>
+        </w:rPr>
+        <w:t xml:space="preserve">Gewinde-Nenndurchmesser</w:t>
+      </w:r>
+      <w:r>
+        <w:t xml:space="preserve"> des gewählten Katalogprodukts (M10 → 10 mm), der </w:t>
+      </w:r>
+      <w:r>
+        <w:rPr>
+          <w:b/>
+          <w:bCs/>
+        </w:rPr>
+        <w:t xml:space="preserve">Kopf</w:t>
+      </w:r>
+      <w:r>
+        <w:t xml:space="preserve"> so breit wie die </w:t>
+      </w:r>
+      <w:r>
+        <w:rPr>
+          <w:b/>
+          <w:bCs/>
+        </w:rPr>
+        <w:t xml:space="preserve">Schlüsselweite</w:t>
+      </w:r>
+      <w:r>
+        <w:t xml:space="preserve"> (17 mm) und so hoch wie das </w:t>
+      </w:r>
+      <w:r>
+        <w:rPr>
+          <w:b/>
+          <w:bCs/>
+        </w:rPr>
+        <w:t xml:space="preserve">Normmaß DIN 933 M10</w:t>
+      </w:r>
+      <w:r>
+        <w:t xml:space="preserve"> (7 mm) – der Kopf ist also breiter als der Schaft. Fehlt ein Katalogmaß, bleibt das betroffene Teil Symbol, der Kopf dabei immer </w:t>
+      </w:r>
+      <w:r>
+        <w:rPr>
+          <w:b/>
+          <w:bCs/>
+        </w:rPr>
+        <w:t xml:space="preserve">ganz</w:t>
+      </w:r>
+      <w:r>
+        <w:t xml:space="preserve"> (Breite und Höhe). Schraube und Kopplungsmutter tragen </w:t>
+      </w:r>
+      <w:r>
+        <w:rPr>
+          <w:b/>
+          <w:bCs/>
+        </w:rPr>
+        <w:t xml:space="preserve">eigene Kennfarben</w:t>
+      </w:r>
+      <w:r>
+        <w:t xml:space="preserve">: die Kopplungsmutter ein </w:t>
+      </w:r>
+      <w:r>
+        <w:rPr>
+          <w:b/>
+          <w:bCs/>
+        </w:rPr>
+        <w:t xml:space="preserve">kräftiges Pink</w:t>
+      </w:r>
+      <w:r>
+        <w:t xml:space="preserve">, damit sie sich klar von den Gewindestangen abhebt – unterscheidbar vom Pink des Reststücks und vom Magenta des Ausgleichspunkts –, die Schraube ein dunkles Braun. Die Symbolgeometrie liegt – wie der Zuschnittschlüssel (</w:t>
       </w:r>
       <w:r>
         <w:rPr>

</xml_diff>

<commit_message>
Deckenanschluss an den Wandenden: je Ende Feld 2 oder 3, nie Feld 1 ([A-26]/[A-27], Miro R01 DA 2/DA 3, #124)
- [A-26] neue Fassung 2026-10-29: Felder = 125-mm-Rasterfelder vom jeweiligen Wandende.
  Je Ende ein Anschluss auf einer Spannachse in Feld 2-3, nie in Feld 1; dazwischen weiter
  hoechstens 1125 mm (DA 1). Rangfolge: Feld 2-3 > kleinste Punktzahl > aeussere Achse.
  Ohne Achse in Feld 2-3: naechste zulaessige Achse, benannt in validation.deckenanschluss_rand.
  Kurze Waende: Ueberlapp der Randzonen traegt einen Punkt; unter 3 Feldern kein Punkt, gemeldet.
- [A-27] Override wird gegen dieselben Randfelder geprueft und benannt, nicht verschoben;
  die ausdruecklich leere Liste bleibt ohne Befund.
- Core + Python-Orakel paritaetisch (deckenanschlussRand), Fixtures unveraendert.
- Modul 1 zeigt Randbefund und 1125-mm-Luecken als Warnung.
- test-blog: Reihenfolge der Eintraege relativ statt ueber feste Positionen geprueft.

Co-Authored-By: Claude Opus 5.5 <noreply@anthropic.com>
</commit_message>
<xml_diff>
--- a/doku/SEMBLA_Handbuch.docx
+++ b/doku/SEMBLA_Handbuch.docx
@@ -18907,30 +18907,90 @@
           <w:b/>
           <w:bCs/>
         </w:rPr>
-        <w:t xml:space="preserve">2026-09-14</w:t>
-      </w:r>
-      <w:r>
-        <w:t xml:space="preserve">, Issue #124): die </w:t>
-      </w:r>
-      <w:r>
-        <w:rPr>
-          <w:b/>
-          <w:bCs/>
-        </w:rPr>
-        <w:t xml:space="preserve">erste und die letzte Spannachse</w:t>
-      </w:r>
-      <w:r>
-        <w:t xml:space="preserve"> der Wand tragen </w:t>
-      </w:r>
-      <w:r>
-        <w:rPr>
-          <w:b/>
-          <w:bCs/>
-        </w:rPr>
-        <w:t xml:space="preserve">immer</w:t>
-      </w:r>
-      <w:r>
-        <w:t xml:space="preserve"> einen Deckenanschluss, und zwischen zwei </w:t>
+        <w:t xml:space="preserve">2026-10-29</w:t>
+      </w:r>
+      <w:r>
+        <w:t xml:space="preserve">, Miro R01 DA 1–DA 3): </w:t>
+      </w:r>
+      <w:r>
+        <w:rPr>
+          <w:b/>
+          <w:bCs/>
+        </w:rPr>
+        <w:t xml:space="preserve">Feld</w:t>
+      </w:r>
+      <w:r>
+        <w:t xml:space="preserve"> heißt hier das </w:t>
+      </w:r>
+      <w:r>
+        <w:rPr>
+          <w:b/>
+          <w:bCs/>
+        </w:rPr>
+        <w:t xml:space="preserve">125-mm-Rasterfeld, gezählt vom jeweiligen Wandende</w:t>
+      </w:r>
+      <w:r>
+        <w:t xml:space="preserve"> – Feld 1 ist das äußerste; die Spannachse auf Rasterindex k liegt vom linken Ende aus in Feld k+1, vom rechten in Feld N−k (N = Rasterbreite der Wand). </w:t>
+      </w:r>
+      <w:r>
+        <w:rPr>
+          <w:b/>
+          <w:bCs/>
+        </w:rPr>
+        <w:t xml:space="preserve">An beiden Wandenden</w:t>
+      </w:r>
+      <w:r>
+        <w:t xml:space="preserve"> steht </w:t>
+      </w:r>
+      <w:r>
+        <w:rPr>
+          <w:b/>
+          <w:bCs/>
+        </w:rPr>
+        <w:t xml:space="preserve">spätestens im 3. Feld</w:t>
+      </w:r>
+      <w:r>
+        <w:t xml:space="preserve"> ein Deckenanschluss (</w:t>
+      </w:r>
+      <w:r>
+        <w:rPr>
+          <w:b/>
+          <w:bCs/>
+        </w:rPr>
+        <w:t xml:space="preserve">DA 2</w:t>
+      </w:r>
+      <w:r>
+        <w:t xml:space="preserve">), und </w:t>
+      </w:r>
+      <w:r>
+        <w:rPr>
+          <w:b/>
+          <w:bCs/>
+        </w:rPr>
+        <w:t xml:space="preserve">im 1. Feld steht nie einer</w:t>
+      </w:r>
+      <w:r>
+        <w:t xml:space="preserve"> (</w:t>
+      </w:r>
+      <w:r>
+        <w:rPr>
+          <w:b/>
+          <w:bCs/>
+        </w:rPr>
+        <w:t xml:space="preserve">DA 3</w:t>
+      </w:r>
+      <w:r>
+        <w:t xml:space="preserve">) – je Ende also ein Anschluss auf einer Spannachse in </w:t>
+      </w:r>
+      <w:r>
+        <w:rPr>
+          <w:b/>
+          <w:bCs/>
+        </w:rPr>
+        <w:t xml:space="preserve">Feld 2 oder 3</w:t>
+      </w:r>
+      <w:r>
+        <w:t xml:space="preserve">. Zwischen zwei </w:t>
       </w:r>
       <w:r>
         <w:rPr>
@@ -18950,7 +19010,17 @@
         <w:t xml:space="preserve">höchstens 1125 mm</w:t>
       </w:r>
       <w:r>
-        <w:t xml:space="preserve"> (neun Rasterfelder). </w:t>
+        <w:t xml:space="preserve"> (neun Rasterfelder, </w:t>
+      </w:r>
+      <w:r>
+        <w:rPr>
+          <w:b/>
+          <w:bCs/>
+        </w:rPr>
+        <w:t xml:space="preserve">DA 1</w:t>
+      </w:r>
+      <w:r>
+        <w:t xml:space="preserve">). </w:t>
       </w:r>
       <w:r>
         <w:rPr>
@@ -18987,20 +19057,40 @@
           <w:b/>
           <w:bCs/>
         </w:rPr>
-        <w:t xml:space="preserve">Kandidat ist jede Spannachse</w:t>
-      </w:r>
-      <w:r>
-        <w:t xml:space="preserve"> der Wand, auch eine, die unter einer Staffelstufe endet – dieselbe Festlegung. – </w:t>
-      </w:r>
-      <w:r>
-        <w:rPr>
-          <w:b/>
-          <w:bCs/>
-        </w:rPr>
-        <w:t xml:space="preserve">Gewählt wird deterministisch und mit der kleinstmöglichen Punktzahl:</w:t>
-      </w:r>
-      <w:r>
-        <w:t xml:space="preserve"> von links nach rechts wird jeweils die </w:t>
+        <w:t xml:space="preserve">Kandidat ist jede Spannachse außerhalb von Feld 1</w:t>
+      </w:r>
+      <w:r>
+        <w:t xml:space="preserve">, auch eine, die unter einer Staffelstufe endet – dieselbe Festlegung. – </w:t>
+      </w:r>
+      <w:r>
+        <w:rPr>
+          <w:b/>
+          <w:bCs/>
+        </w:rPr>
+        <w:t xml:space="preserve">Gewählt wird deterministisch, in dieser Rangfolge:</w:t>
+      </w:r>
+      <w:r>
+        <w:t xml:space="preserve"> (1) je Wandende eine Achse in Feld 2–3, (2) die </w:t>
+      </w:r>
+      <w:r>
+        <w:rPr>
+          <w:b/>
+          <w:bCs/>
+        </w:rPr>
+        <w:t xml:space="preserve">kleinstmögliche Punktzahl</w:t>
+      </w:r>
+      <w:r>
+        <w:t xml:space="preserve">, (3) bei Gleichstand je Ende die </w:t>
+      </w:r>
+      <w:r>
+        <w:rPr>
+          <w:b/>
+          <w:bCs/>
+        </w:rPr>
+        <w:t xml:space="preserve">äußere</w:t>
+      </w:r>
+      <w:r>
+        <w:t xml:space="preserve"> Achse (Feld 2 vor Feld 3, links vor rechts). Zwischen den beiden Randpunkten wird von links nach rechts jeweils die </w:t>
       </w:r>
       <w:r>
         <w:rPr>
@@ -19010,27 +19100,187 @@
         <w:t xml:space="preserve">entfernteste</w:t>
       </w:r>
       <w:r>
-        <w:t xml:space="preserve"> Spannachse gesetzt, die von der zuletzt gesetzten aus noch innerhalb von 1125 mm liegt, zuletzt zwingend die letzte Achse. Eine Wand mit nur </w:t>
-      </w:r>
-      <w:r>
-        <w:rPr>
-          <w:b/>
-          <w:bCs/>
-        </w:rPr>
-        <w:t xml:space="preserve">einer</w:t>
-      </w:r>
-      <w:r>
-        <w:t xml:space="preserve"> Spannachse trägt genau </w:t>
-      </w:r>
-      <w:r>
-        <w:rPr>
-          <w:b/>
-          <w:bCs/>
-        </w:rPr>
-        <w:t xml:space="preserve">einen</w:t>
-      </w:r>
-      <w:r>
-        <w:t xml:space="preserve"> Punkt. Die Rechnung ist eine </w:t>
+        <w:t xml:space="preserve"> Spannachse gesetzt, die von der zuletzt gesetzten aus noch innerhalb von 1125 mm liegt. Die Regel arbeitet auf </w:t>
+      </w:r>
+      <w:r>
+        <w:rPr>
+          <w:b/>
+          <w:bCs/>
+        </w:rPr>
+        <w:t xml:space="preserve">beliebigen Achslagen</w:t>
+      </w:r>
+      <w:r>
+        <w:t xml:space="preserve"> und greift </w:t>
+      </w:r>
+      <w:r>
+        <w:rPr>
+          <w:b/>
+          <w:bCs/>
+        </w:rPr>
+        <w:t xml:space="preserve">nicht</w:t>
+      </w:r>
+      <w:r>
+        <w:t xml:space="preserve"> in die Spannachsenverteilung ein: steht etwa am Wandende eine Achse in Feld 1 </w:t>
+      </w:r>
+      <w:r>
+        <w:rPr>
+          <w:b/>
+          <w:bCs/>
+        </w:rPr>
+        <w:t xml:space="preserve">und</w:t>
+      </w:r>
+      <w:r>
+        <w:t xml:space="preserve"> eine in Feld 3, sitzt der Anschluss in Feld 3. – </w:t>
+      </w:r>
+      <w:r>
+        <w:rPr>
+          <w:b/>
+          <w:bCs/>
+        </w:rPr>
+        <w:t xml:space="preserve">Steht an einem Ende in Feld 2–3 keine Spannachse, wird keine erfunden:</w:t>
+      </w:r>
+      <w:r>
+        <w:t xml:space="preserve"> genommen wird die </w:t>
+      </w:r>
+      <w:r>
+        <w:rPr>
+          <w:b/>
+          <w:bCs/>
+        </w:rPr>
+        <w:t xml:space="preserve">nächste zulässige</w:t>
+      </w:r>
+      <w:r>
+        <w:t xml:space="preserve"> Achse (die dem Ende nächste außerhalb von Feld 1), und das Ende wird </w:t>
+      </w:r>
+      <w:r>
+        <w:rPr>
+          <w:b/>
+          <w:bCs/>
+        </w:rPr>
+        <w:t xml:space="preserve">sichtbar benannt</w:t>
+      </w:r>
+      <w:r>
+        <w:t xml:space="preserve"> (validation.deckenanschluss_rand, Grund „kein Anschluss in Feld 2–3“ mit dem tatsächlichen Feld; Modul 1 zeigt es als Warnung). – </w:t>
+      </w:r>
+      <w:r>
+        <w:rPr>
+          <w:b/>
+          <w:bCs/>
+        </w:rPr>
+        <w:t xml:space="preserve">Kurze Wände:</w:t>
+      </w:r>
+      <w:r>
+        <w:t xml:space="preserve"> Bei </w:t>
+      </w:r>
+      <w:r>
+        <w:rPr>
+          <w:b/>
+          <w:bCs/>
+        </w:rPr>
+        <w:t xml:space="preserve">weniger als sechs</w:t>
+      </w:r>
+      <w:r>
+        <w:t xml:space="preserve"> Feldern überlappen die Felder 2–3 der beiden Enden; </w:t>
+      </w:r>
+      <w:r>
+        <w:rPr>
+          <w:b/>
+          <w:bCs/>
+        </w:rPr>
+        <w:t xml:space="preserve">eine</w:t>
+      </w:r>
+      <w:r>
+        <w:t xml:space="preserve"> Achse im Überlapp erfüllt dann beide Enden, und es entsteht </w:t>
+      </w:r>
+      <w:r>
+        <w:rPr>
+          <w:b/>
+          <w:bCs/>
+        </w:rPr>
+        <w:t xml:space="preserve">genau ein</w:t>
+      </w:r>
+      <w:r>
+        <w:t xml:space="preserve"> Punkt (z. B. drei Felder: die mittlere Achse ist von beiden Enden Feld 2). Eine Wand mit </w:t>
+      </w:r>
+      <w:r>
+        <w:rPr>
+          <w:b/>
+          <w:bCs/>
+        </w:rPr>
+        <w:t xml:space="preserve">nur einer</w:t>
+      </w:r>
+      <w:r>
+        <w:t xml:space="preserve"> Spannachse trägt genau diesen einen Punkt, sofern die Achse nicht in Feld 1 liegt. Bei </w:t>
+      </w:r>
+      <w:r>
+        <w:rPr>
+          <w:b/>
+          <w:bCs/>
+        </w:rPr>
+        <w:t xml:space="preserve">weniger als drei</w:t>
+      </w:r>
+      <w:r>
+        <w:t xml:space="preserve"> Feldern (einzelner i2, 250 mm) ist </w:t>
+      </w:r>
+      <w:r>
+        <w:rPr>
+          <w:b/>
+          <w:bCs/>
+        </w:rPr>
+        <w:t xml:space="preserve">jedes</w:t>
+      </w:r>
+      <w:r>
+        <w:t xml:space="preserve"> Feld von einem der Enden aus Feld 1 – die Regel ist dort </w:t>
+      </w:r>
+      <w:r>
+        <w:rPr>
+          <w:b/>
+          <w:bCs/>
+        </w:rPr>
+        <w:t xml:space="preserve">unerfüllbar</w:t>
+      </w:r>
+      <w:r>
+        <w:t xml:space="preserve">: es entsteht </w:t>
+      </w:r>
+      <w:r>
+        <w:rPr>
+          <w:b/>
+          <w:bCs/>
+        </w:rPr>
+        <w:t xml:space="preserve">kein</w:t>
+      </w:r>
+      <w:r>
+        <w:t xml:space="preserve"> Punkt, und </w:t>
+      </w:r>
+      <w:r>
+        <w:rPr>
+          <w:b/>
+          <w:bCs/>
+        </w:rPr>
+        <w:t xml:space="preserve">beide</w:t>
+      </w:r>
+      <w:r>
+        <w:t xml:space="preserve"> Enden werden benannt; ein Anschluss in Feld 1 wird </w:t>
+      </w:r>
+      <w:r>
+        <w:rPr>
+          <w:b/>
+          <w:bCs/>
+        </w:rPr>
+        <w:t xml:space="preserve">nicht</w:t>
+      </w:r>
+      <w:r>
+        <w:t xml:space="preserve"> ersatzweise gesetzt (</w:t>
+      </w:r>
+      <w:r>
+        <w:rPr>
+          <w:b/>
+          <w:bCs/>
+        </w:rPr>
+        <w:t xml:space="preserve">[P-9]</w:t>
+      </w:r>
+      <w:r>
+        <w:t xml:space="preserve">). Die Rechnung ist eine </w:t>
       </w:r>
       <w:r>
         <w:rPr>
@@ -19550,7 +19800,107 @@
         <w:t xml:space="preserve">[A-26]</w:t>
       </w:r>
       <w:r>
-        <w:t xml:space="preserve">). Ein </w:t>
+        <w:t xml:space="preserve">). </w:t>
+      </w:r>
+      <w:r>
+        <w:rPr>
+          <w:b/>
+          <w:bCs/>
+        </w:rPr>
+        <w:t xml:space="preserve">Die Randfelder nach [A-26] (DA 2/DA 3) werden auch am Override geprüft, aber nicht erzwungen</w:t>
+      </w:r>
+      <w:r>
+        <w:t xml:space="preserve"> (Fassung vom </w:t>
+      </w:r>
+      <w:r>
+        <w:rPr>
+          <w:b/>
+          <w:bCs/>
+        </w:rPr>
+        <w:t xml:space="preserve">2026-10-29</w:t>
+      </w:r>
+      <w:r>
+        <w:t xml:space="preserve">): ein gesetzter Punkt in </w:t>
+      </w:r>
+      <w:r>
+        <w:rPr>
+          <w:b/>
+          <w:bCs/>
+        </w:rPr>
+        <w:t xml:space="preserve">Feld 1</w:t>
+      </w:r>
+      <w:r>
+        <w:t xml:space="preserve"> und ein Wandende </w:t>
+      </w:r>
+      <w:r>
+        <w:rPr>
+          <w:b/>
+          <w:bCs/>
+        </w:rPr>
+        <w:t xml:space="preserve">ohne</w:t>
+      </w:r>
+      <w:r>
+        <w:t xml:space="preserve"> Anschluss bis </w:t>
+      </w:r>
+      <w:r>
+        <w:rPr>
+          <w:b/>
+          <w:bCs/>
+        </w:rPr>
+        <w:t xml:space="preserve">Feld 3</w:t>
+      </w:r>
+      <w:r>
+        <w:t xml:space="preserve"> werden je Ende </w:t>
+      </w:r>
+      <w:r>
+        <w:rPr>
+          <w:b/>
+          <w:bCs/>
+        </w:rPr>
+        <w:t xml:space="preserve">benannt</w:t>
+      </w:r>
+      <w:r>
+        <w:t xml:space="preserve"> (validation.deckenanschluss_rand, in Modul 1 als Warnung) – der Punkt bleibt, wo er gesetzt ist, und es wird </w:t>
+      </w:r>
+      <w:r>
+        <w:rPr>
+          <w:b/>
+          <w:bCs/>
+        </w:rPr>
+        <w:t xml:space="preserve">nichts</w:t>
+      </w:r>
+      <w:r>
+        <w:t xml:space="preserve"> verschoben oder nachgeschoben (</w:t>
+      </w:r>
+      <w:r>
+        <w:rPr>
+          <w:b/>
+          <w:bCs/>
+        </w:rPr>
+        <w:t xml:space="preserve">[P-9]</w:t>
+      </w:r>
+      <w:r>
+        <w:t xml:space="preserve">). Die ausdrücklich </w:t>
+      </w:r>
+      <w:r>
+        <w:rPr>
+          <w:b/>
+          <w:bCs/>
+        </w:rPr>
+        <w:t xml:space="preserve">leere</w:t>
+      </w:r>
+      <w:r>
+        <w:t xml:space="preserve"> Liste („kein Deckenanschluss“) ist davon ausgenommen; die </w:t>
+      </w:r>
+      <w:r>
+        <w:rPr>
+          <w:b/>
+          <w:bCs/>
+        </w:rPr>
+        <w:t xml:space="preserve">1125-mm-Meldung</w:t>
+      </w:r>
+      <w:r>
+        <w:t xml:space="preserve"> gilt weiterhin nur dem Auto-Pfad. Ein </w:t>
       </w:r>
       <w:r>
         <w:rPr>
@@ -19682,7 +20032,17 @@
         <w:t xml:space="preserve">Verteilregel selbst trägt seit Issue #124 die Fassung vom 2026-09-14</w:t>
       </w:r>
       <w:r>
-        <w:t xml:space="preserve">: Anfangs- und Endachse immer, dazwischen höchstens 1125 mm Abstand – sie ersetzt die ursprüngliche Fassung „ein Deckenanschluss je angefangenem Meter Wandlänge, gleichmäßig über die Achsenliste“. [A-27] ist davon unberührt: ein Override sperrt die Verteilung weiterhin vollständig, und die 1125-mm-Meldung gilt ausdrücklich nur dem Auto-Pfad – die gesetzte Liste ist die Entscheidung des Planers. Mit [P-24] war bis dahin nur die Baugruppe angelegt: der Rechenkern kannte die Einbaustelle nicht, die Baugruppe blieb darum ausdrücklich unaufgelöst, und eine Anzahl ließ sich nirgends gewinnen. Nicht Gegenstand des zweiten Pakets waren die Darstellung des Symbols in Wandansicht und Zeichnung ([D-4]/[D-10], #97) – die Griffe des Editiermodus sind eine Bedienhilfe und nur bei aktivem Modus vorhanden – und die Stücklistenmenge samt der nach [P-24] nötigen Verrechnung mit der Baugruppe „Wandabschluss“; beides ist mit dem dritten Arbeitspaket zu #95 nachgezogen. Ebenso bewusst nicht: ein Verankerungs- oder Winkelnachweis; Modul 3 bleibt unverändert.</w:t>
+        <w:t xml:space="preserve">: Anfangs- und Endachse immer, dazwischen höchstens 1125 mm Abstand – sie ersetzt die ursprüngliche Fassung „ein Deckenanschluss je angefangenem Meter Wandlänge, gleichmäßig über die Achsenliste“. [A-27] ist davon unberührt: ein Override sperrt die Verteilung weiterhin vollständig, und die 1125-mm-Meldung gilt ausdrücklich nur dem Auto-Pfad – die gesetzte Liste ist die Entscheidung des Planers. – </w:t>
+      </w:r>
+      <w:r>
+        <w:rPr>
+          <w:b/>
+          <w:bCs/>
+        </w:rPr>
+        <w:t xml:space="preserve">Fassung vom 2026-10-29</w:t>
+      </w:r>
+      <w:r>
+        <w:t xml:space="preserve"> (Herkunft: Miro R01 / Felix Bauroth, 28.10.2026, Zeilen DA 2 und DA 3, Status „Übernehmen“; KKI 3 ist darin aufgegangen, KKI 1 ist obsolet und DA 1 – höchstens 1125 mm – bleibt): die frühere Vorgabe „erste und letzte Spannachse immer“ ist ersetzt durch „je Wandende ein Anschluss in Feld 2 oder 3, nie in Feld 1“. Der Override nach [A-27] wird seitdem gegen dieselben Randfelder geprüft und benannt, aber nicht korrigiert. Festgelegt wurden dabei die Rangfolge bei zwei Kandidaten je Ende (zuerst weniger Punkte, dann die äußere Achse), die Behandlung kurzer Wände und der Fall ohne Achse in Feld 2–3 (nächste zulässige Achse, benannt). Mit [P-24] war bis dahin nur die Baugruppe angelegt: der Rechenkern kannte die Einbaustelle nicht, die Baugruppe blieb darum ausdrücklich unaufgelöst, und eine Anzahl ließ sich nirgends gewinnen. Nicht Gegenstand des zweiten Pakets waren die Darstellung des Symbols in Wandansicht und Zeichnung ([D-4]/[D-10], #97) – die Griffe des Editiermodus sind eine Bedienhilfe und nur bei aktivem Modus vorhanden – und die Stücklistenmenge samt der nach [P-24] nötigen Verrechnung mit der Baugruppe „Wandabschluss“; beides ist mit dem dritten Arbeitspaket zu #95 nachgezogen. Ebenso bewusst nicht: ein Verankerungs- oder Winkelnachweis; Modul 3 bleibt unverändert.</w:t>
       </w:r>
     </w:p>
     <w:p>

</xml_diff>

<commit_message>
Spannachsen manuell gesetzt: sichtbarer Hinweis in Modul 1 und in der Geschossplan-Wandliste ([V-9], Miro R01 SA 4, #122)
- Modul 1: Badge „Spannachsen manuell (n)" im Ansichtskopf, Hinweiszeile an den Achsen-Knoepfen
  (Verteilung aus, „Zurueck zu Auto" setzt zurueck), validation.ungehaltene_steine als
  [V-9]/[V-2]-Warnung mit Lage/Raster. Quelle allein prestress.columns_grid.
- Geschosseditor: Kennzeichnung je Wand in der Wandliste (nur gelesen).
- Handbuch [V-9] um den Hinweis ergaenzt (Felix Bauroth, 29.10.2026), nicht auf dem
  Zeichnungsblatt. Keine Rechenlogik, kein Feld, kein Versionssprung.

Co-Authored-By: Claude Opus 5.5 <noreply@anthropic.com>
</commit_message>
<xml_diff>
--- a/doku/SEMBLA_Handbuch.docx
+++ b/doku/SEMBLA_Handbuch.docx
@@ -13890,7 +13890,37 @@
         <w:t xml:space="preserve">nicht</w:t>
       </w:r>
       <w:r>
-        <w:t xml:space="preserve"> zum Baubarkeitsausschluss und wird nie still korrigiert – die Sonderkonstruktion ist eine bewusste Anwenderentscheidung. Im Auto-Pfad ist die Liste konstruktionsbedingt leer und dient als Selbstkontrolle.</w:t>
+        <w:t xml:space="preserve"> zum Baubarkeitsausschluss und wird nie still korrigiert – die Sonderkonstruktion ist eine bewusste Anwenderentscheidung. Im Auto-Pfad ist die Liste konstruktionsbedingt leer und dient als Selbstkontrolle. </w:t>
+      </w:r>
+      <w:r>
+        <w:rPr>
+          <w:b/>
+          <w:bCs/>
+        </w:rPr>
+        <w:t xml:space="preserve">Bedienung und Hinweis (Felix Bauroth, 29.10.2026):</w:t>
+      </w:r>
+      <w:r>
+        <w:t xml:space="preserve"> Beim ersten Bearbeiten in Modul 1 werden die automatisch verteilten Achsen als Startliste übernommen; ab dann gelten nur noch die gesetzten Achsen, und das Tool ändert sie nicht mehr, bis „Zurück zu Auto“ den Override zurücknimmt. Eine solche Wand zeigt das im </w:t>
+      </w:r>
+      <w:r>
+        <w:rPr>
+          <w:b/>
+          <w:bCs/>
+        </w:rPr>
+        <w:t xml:space="preserve">Planungstool gut sichtbar</w:t>
+      </w:r>
+      <w:r>
+        <w:t xml:space="preserve"> an – in Modul 1 als Kennzeichnung „Spannachsen manuell“ mit der Zahl der Achsen samt Hinweis auf die abgeschaltete Verteilung und die [V-2]-Befunde, in der Wandliste des Geschosseditors als Kennzeichnung je Wand. Der Hinweis ist reine Anzeige aus prestress.columns_grid und steht </w:t>
+      </w:r>
+      <w:r>
+        <w:rPr>
+          <w:b/>
+          <w:bCs/>
+        </w:rPr>
+        <w:t xml:space="preserve">nicht</w:t>
+      </w:r>
+      <w:r>
+        <w:t xml:space="preserve"> auf dem Zeichnungsblatt (Planexport: noch zu klären).</w:t>
       </w:r>
     </w:p>
     <w:p>

</xml_diff>